<commit_message>
Docs: ajourfoer godkendelsespakke + sporbarhedsmatrix (central auth, SAF-T-input, analyse-moduler, robust scope; 103 kontroller / v1.1.0)
</commit_message>
<xml_diff>
--- a/docs/VAT-Analytics_Godkendelses-overblik.docx
+++ b/docs/VAT-Analytics_Godkendelses-overblik.docx
@@ -70,7 +70,7 @@
           <w:sz w:val="20"/>
           <w:szCs w:val="20"/>
         </w:rPr>
-        <w:t xml:space="preserve">Bal AI · 16. juni 2026 · katalogversion 1.0.0</w:t>
+        <w:t xml:space="preserve">Bal AI · 16. juni 2026 · katalogversion 1.1.0</w:t>
       </w:r>
     </w:p>
     <w:p>
@@ -91,7 +91,7 @@
         <w:spacing w:after="120"/>
       </w:pPr>
       <w:r>
-        <w:t xml:space="preserve">VAT Analytics er et webbaseret værktøj, der kører 103 automatiserede momskontroller (baseret på Skattestyrelsens kontrolmetoder) mod et momsdataudtræk fra en virksomheds bogføring (Excel/CSV). Kontrollerne er fordelt på 12 kategorier — fra transaktionsintegritet og dubletter over momssats, grænseoverskridende handel og reverse charge til afstemning, statistisk anomalidetektion, svindel/MTIC og e-handelssærordninger.</w:t>
+        <w:t xml:space="preserve">VAT Analytics er et webbaseret værktøj, der kører 103 automatiserede momskontroller (baseret på Skattestyrelsens kontrolmetoder) mod et momsdataudtræk fra en virksomheds bogføring. Input kan være et fladt udtræk (Excel/CSV) ELLER en dansk SAF-T Financial-fil (v1.0/2.0/2.1); begge kilder giver samme kanoniske struktur til motoren. Kontrollerne er fordelt på 12 kategorier — fra transaktionsintegritet og dubletter over momssats, grænseoverskridende handel og reverse charge til afstemning, statistisk anomalidetektion, svindel/MTIC og e-handelssærordninger.</w:t>
       </w:r>
     </w:p>
     <w:p>
@@ -100,6 +100,14 @@
       </w:pPr>
       <w:r>
         <w:t xml:space="preserve">For hvert fund angives en sporbar reference til den eller de berørte kildetransaktioner (bilag, dato, konto, beløb, det felt der udløste fundet), en impact-klassifikation (økonomisk, renterisiko eller compliance) og en sværhedsgrad. Resultatet præsenteres som en prioriteret liste frem for en mur af flag.</w:t>
+      </w:r>
+    </w:p>
+    <w:p>
+      <w:pPr>
+        <w:spacing w:after="120"/>
+      </w:pPr>
+      <w:r>
+        <w:t xml:space="preserve">Kontrollerne er delt i momsrelevans-moduler: en momskerne (default TIL) med de kontroller, der har en direkte momsfaglig konsekvens, og udvidede moduler (forensic/statistik, e-handel/særordninger, datakvalitet, dublet-recovery) der er default FRA og kan tændes efter behov. En standardkørsel viser dermed momskernen — den egentlige momsgennemgang — frem for en mur af flag.</w:t>
       </w:r>
     </w:p>
     <w:p>
@@ -863,7 +871,7 @@
                 <w:b w:val="false"/>
                 <w:bCs w:val="false"/>
               </w:rPr>
-              <w:t xml:space="preserve">Session-auth (pbkdf2), /setup, invitationer, rate-limit, CSRF — porteret til FastAPI.</w:t>
+              <w:t xml:space="preserve">Central BALAI-brugerstyring (login/setup/admin på auth.balai.dk); appen håndhæver adgang til slug “vat”.</w:t>
             </w:r>
           </w:p>
         </w:tc>
@@ -971,7 +979,7 @@
                 <w:b w:val="false"/>
                 <w:bCs w:val="false"/>
               </w:rPr>
-              <w:t xml:space="preserve">Regelkatalog &amp; sporbarhed</w:t>
+              <w:t xml:space="preserve">Input Excel/CSV + SAF-T</w:t>
             </w:r>
           </w:p>
         </w:tc>
@@ -997,7 +1005,7 @@
                 <w:b w:val="false"/>
                 <w:bCs w:val="false"/>
               </w:rPr>
-              <w:t xml:space="preserve">Grøn*</w:t>
+              <w:t xml:space="preserve">Grøn</w:t>
             </w:r>
           </w:p>
         </w:tc>
@@ -1023,7 +1031,7 @@
                 <w:b w:val="false"/>
                 <w:bCs w:val="false"/>
               </w:rPr>
-              <w:t xml:space="preserve">Versioneret katalog (103 kontroller) + matrix. *Præcis momslov-kilde pr. kontrol pinnes af fagansvarlig.</w:t>
+              <w:t xml:space="preserve">Fladt udtræk eller dansk SAF-T Financial (v1.0/2.0/2.1); best-effort, XML-hærdet.</w:t>
             </w:r>
           </w:p>
         </w:tc>
@@ -1051,7 +1059,7 @@
                 <w:b w:val="false"/>
                 <w:bCs w:val="false"/>
               </w:rPr>
-              <w:t xml:space="preserve">Uafhængig validering</w:t>
+              <w:t xml:space="preserve">Momsrelevans-moduler</w:t>
             </w:r>
           </w:p>
         </w:tc>
@@ -1103,7 +1111,7 @@
                 <w:b w:val="false"/>
                 <w:bCs w:val="false"/>
               </w:rPr>
-              <w:t xml:space="preserve">Valideringssuite: 98/98 aktive kontroller med plantet defekt, gated i CI.</w:t>
+              <w:t xml:space="preserve">Momskerne default TIL; udvidede moduler default FRA. Hver kontrol bærer analyse_modul + default_aktiv i kataloget.</w:t>
             </w:r>
           </w:p>
         </w:tc>
@@ -1131,7 +1139,7 @@
                 <w:b w:val="false"/>
                 <w:bCs w:val="false"/>
               </w:rPr>
-              <w:t xml:space="preserve">Datapolitik</w:t>
+              <w:t xml:space="preserve">Regelkatalog &amp; sporbarhed</w:t>
             </w:r>
           </w:p>
         </w:tc>
@@ -1157,7 +1165,7 @@
                 <w:b w:val="false"/>
                 <w:bCs w:val="false"/>
               </w:rPr>
-              <w:t xml:space="preserve">Grøn</w:t>
+              <w:t xml:space="preserve">Grøn*</w:t>
             </w:r>
           </w:p>
         </w:tc>
@@ -1183,7 +1191,7 @@
                 <w:b w:val="false"/>
                 <w:bCs w:val="false"/>
               </w:rPr>
-              <w:t xml:space="preserve">Ikke-arkiv: inputfil slettes efter kørsel; resultater kun i hukommelsen; audit kun metadata.</w:t>
+              <w:t xml:space="preserve">Versioneret katalog (103 kontroller) + matrix. *Præcis momslov-kilde pr. kontrol pinnes af fagansvarlig.</w:t>
             </w:r>
           </w:p>
         </w:tc>
@@ -1211,7 +1219,7 @@
                 <w:b w:val="false"/>
                 <w:bCs w:val="false"/>
               </w:rPr>
-              <w:t xml:space="preserve">Importkontrakt</w:t>
+              <w:t xml:space="preserve">Uafhængig validering</w:t>
             </w:r>
           </w:p>
         </w:tc>
@@ -1263,7 +1271,7 @@
                 <w:b w:val="false"/>
                 <w:bCs w:val="false"/>
               </w:rPr>
-              <w:t xml:space="preserve">Udvidet med ship_from/ship_to, adskilt faktura-/bogføringsdato og tax_base; drevet af delt feltkontrakt.</w:t>
+              <w:t xml:space="preserve">Valideringssuite: 98/98 aktive kontroller med plantet defekt, gated i CI.</w:t>
             </w:r>
           </w:p>
         </w:tc>
@@ -1291,7 +1299,7 @@
                 <w:b w:val="false"/>
                 <w:bCs w:val="false"/>
               </w:rPr>
-              <w:t xml:space="preserve">Drift / hosting</w:t>
+              <w:t xml:space="preserve">Datapolitik</w:t>
             </w:r>
           </w:p>
         </w:tc>
@@ -1317,7 +1325,7 @@
                 <w:b w:val="false"/>
                 <w:bCs w:val="false"/>
               </w:rPr>
-              <w:t xml:space="preserve">Gul</w:t>
+              <w:t xml:space="preserve">Grøn</w:t>
             </w:r>
           </w:p>
         </w:tc>
@@ -1343,7 +1351,7 @@
                 <w:b w:val="false"/>
                 <w:bCs w:val="false"/>
               </w:rPr>
-              <w:t xml:space="preserve">Live i EU (Railway, 1 worker/1 replica). Produktionsdrift på EY-platform er en forudsætning.</w:t>
+              <w:t xml:space="preserve">Ikke-arkiv: inputfil slettes efter kørsel; resultater kun i hukommelsen; audit kun metadata.</w:t>
             </w:r>
           </w:p>
         </w:tc>
@@ -1371,6 +1379,86 @@
                 <w:b w:val="false"/>
                 <w:bCs w:val="false"/>
               </w:rPr>
+              <w:t xml:space="preserve">Drift / hosting</w:t>
+            </w:r>
+          </w:p>
+        </w:tc>
+        <w:tc>
+          <w:tcPr>
+            <w:tcW w:type="dxa" w:w="1100"/>
+            <w:tcBorders>
+              <w:top w:val="single" w:color="CCCCCC" w:sz="1"/>
+              <w:left w:val="single" w:color="CCCCCC" w:sz="1"/>
+              <w:bottom w:val="single" w:color="CCCCCC" w:sz="1"/>
+              <w:right w:val="single" w:color="CCCCCC" w:sz="1"/>
+            </w:tcBorders>
+            <w:tcMar>
+              <w:top w:type="dxa" w:w="80"/>
+              <w:left w:type="dxa" w:w="120"/>
+              <w:bottom w:type="dxa" w:w="80"/>
+              <w:right w:type="dxa" w:w="120"/>
+            </w:tcMar>
+          </w:tcPr>
+          <w:p>
+            <w:r>
+              <w:rPr>
+                <w:b w:val="false"/>
+                <w:bCs w:val="false"/>
+              </w:rPr>
+              <w:t xml:space="preserve">Gul</w:t>
+            </w:r>
+          </w:p>
+        </w:tc>
+        <w:tc>
+          <w:tcPr>
+            <w:tcW w:type="dxa" w:w="5560"/>
+            <w:tcBorders>
+              <w:top w:val="single" w:color="CCCCCC" w:sz="1"/>
+              <w:left w:val="single" w:color="CCCCCC" w:sz="1"/>
+              <w:bottom w:val="single" w:color="CCCCCC" w:sz="1"/>
+              <w:right w:val="single" w:color="CCCCCC" w:sz="1"/>
+            </w:tcBorders>
+            <w:tcMar>
+              <w:top w:type="dxa" w:w="80"/>
+              <w:left w:type="dxa" w:w="120"/>
+              <w:bottom w:type="dxa" w:w="80"/>
+              <w:right w:type="dxa" w:w="120"/>
+            </w:tcMar>
+          </w:tcPr>
+          <w:p>
+            <w:r>
+              <w:rPr>
+                <w:b w:val="false"/>
+                <w:bCs w:val="false"/>
+              </w:rPr>
+              <w:t xml:space="preserve">Live i EU (Railway, 1 worker/1 replica). Produktionsdrift på EY-platform er en forudsætning.</w:t>
+            </w:r>
+          </w:p>
+        </w:tc>
+      </w:tr>
+      <w:tr>
+        <w:tc>
+          <w:tcPr>
+            <w:tcW w:type="dxa" w:w="2700"/>
+            <w:tcBorders>
+              <w:top w:val="single" w:color="CCCCCC" w:sz="1"/>
+              <w:left w:val="single" w:color="CCCCCC" w:sz="1"/>
+              <w:bottom w:val="single" w:color="CCCCCC" w:sz="1"/>
+              <w:right w:val="single" w:color="CCCCCC" w:sz="1"/>
+            </w:tcBorders>
+            <w:tcMar>
+              <w:top w:type="dxa" w:w="80"/>
+              <w:left w:type="dxa" w:w="120"/>
+              <w:bottom w:type="dxa" w:w="80"/>
+              <w:right w:type="dxa" w:w="120"/>
+            </w:tcMar>
+          </w:tcPr>
+          <w:p>
+            <w:r>
+              <w:rPr>
+                <w:b w:val="false"/>
+                <w:bCs w:val="false"/>
+              </w:rPr>
               <w:t xml:space="preserve">Stress-test på rigtige data</w:t>
             </w:r>
           </w:p>
@@ -1423,7 +1511,7 @@
                 <w:b w:val="false"/>
                 <w:bCs w:val="false"/>
               </w:rPr>
-              <w:t xml:space="preserve">Kørsel på et reelt klientudtræk (tæl røde → reelle) udestår.</w:t>
+              <w:t xml:space="preserve">To reelle SAF-T-klientfiler kørt (robust scope bekræftet); fuld rød→reel-optælling udestår.</w:t>
             </w:r>
           </w:p>
         </w:tc>
@@ -1623,7 +1711,7 @@
           <w:b/>
           <w:bCs/>
         </w:rPr>
-        <w:t xml:space="preserve">Status pr. 16. juni 2026: Alt der kan lukkes i kode og dokumentation internt, er på plads — versioneret regelkatalog, sporbarhedsmatrix, uafhængig valideringssuite (98/98 gated i CI), porteret session-auth, stram HTTP-sikkerhed, udvidet importkontrakt og drift i EU. De resterende punkter er bevidst markeret som åbne, fordi de kræver EY-beslutninger, faglig pinning eller eksterne parter.</w:t>
+        <w:t xml:space="preserve">Status pr. 16. juni 2026: Alt der kan lukkes i kode og dokumentation internt, er på plads — versioneret regelkatalog, sporbarhedsmatrix, uafhængig valideringssuite (98/98 gated i CI), central BALAI-brugerstyring, stram HTTP-sikkerhed, dobbelt input (Excel/CSV + SAF-T), momsrelevans-moduler og drift i EU. De resterende punkter er bevidst markeret som åbne, fordi de kræver EY-beslutninger, faglig pinning eller eksterne parter.</w:t>
       </w:r>
     </w:p>
     <w:sectPr>

</xml_diff>